<commit_message>
Deploy simternship build 2026-09-16
</commit_message>
<xml_diff>
--- a/hub/files/Case3.docx
+++ b/hub/files/Case3.docx
@@ -251,7 +251,7 @@
               <w:rPr>
                 <w:sz w:val="19"/>
               </w:rPr>
-              <w:t>, the whole chat pasted from the top); Team 2 uploads slides to the separate 10-point Mini-Case Presentation team assignment before class</w:t>
+              <w:t>, the whole chat pasted from the top); Team 2 uploads its slides to the separate Mini-Case Presentation assignment before class</w:t>
             </w:r>
           </w:p>
         </w:tc>
@@ -284,7 +284,7 @@
         <w:t>this</w:t>
       </w:r>
       <w:r>
-        <w:t xml:space="preserve"> case. One team presents the case named in its Canvas group ("Team N presents Case N+1"); the group name never changes which write-up is due.</w:t>
+        <w:t xml:space="preserve"> case; one team presents the case named in its Canvas group ("Team N presents Case N+1").</w:t>
       </w:r>
     </w:p>
     <w:p>
@@ -534,7 +534,16 @@
         <w:t>Team 2 (presenters):</w:t>
       </w:r>
       <w:r>
-        <w:t xml:space="preserve"> build a fresh presentation that teaches the choice logic between methods — keep focus group vs. IDI and observation vs. experiment straight — and add at least one thing that goes beyond the Monday lecture.</w:t>
+        <w:t xml:space="preserve"> prepare the walkthrough (format under </w:t>
+      </w:r>
+      <w:r>
+        <w:rPr>
+          <w:i/>
+        </w:rPr>
+        <w:t>How you'll be graded</w:t>
+      </w:r>
+      <w:r>
+        <w:t>); the concept to name is the choice logic between methods — keep focus group vs. IDI and observation vs. experiment straight.</w:t>
       </w:r>
     </w:p>
     <w:p>
@@ -657,7 +666,7 @@
         <w:t xml:space="preserve">☐  </w:t>
       </w:r>
       <w:r>
-        <w:t>Slides — Team 2 only, uploaded to the separate Mini-Case Presentation team assignment before class</w:t>
+        <w:t>Walkthrough slides (3–6) — Team 2 only, uploaded to the separate Mini-Case Presentation team assignment before class</w:t>
       </w:r>
     </w:p>
     <w:p>
@@ -696,37 +705,55 @@
         <w:rPr>
           <w:b/>
         </w:rPr>
-        <w:t>The presentation (Team 2):</w:t>
+        <w:t>The walkthrough (Team 2, 10 min + 5 min discussion, Wed Sep 23; later teams do this on Mondays):</w:t>
       </w:r>
       <w:r>
-        <w:t xml:space="preserve"> present fresh — there is no prior recording to study. In a </w:t>
+        <w:t xml:space="preserve"> walk the class through your own three-box work — (1) </w:t>
       </w:r>
       <w:r>
         <w:rPr>
           <w:b/>
         </w:rPr>
-        <w:t>20-minute block (15 min presentation + 5 min Q&amp;A)</w:t>
+        <w:t>Box A</w:t>
       </w:r>
       <w:r>
-        <w:t xml:space="preserve">: (1) </w:t>
+        <w:t xml:space="preserve">, one member's honest first take; (2) </w:t>
       </w:r>
       <w:r>
         <w:rPr>
           <w:b/>
         </w:rPr>
-        <w:t>teach the case's key idea</w:t>
+        <w:t>the push</w:t>
       </w:r>
       <w:r>
-        <w:t xml:space="preserve"> clearly enough that a classmate could apply it on the final exam, and (2) go </w:t>
+        <w:t xml:space="preserve">: the tutor exchange shown on screen, and what you did with it and why; (3) </w:t>
       </w:r>
       <w:r>
         <w:rPr>
           <w:b/>
         </w:rPr>
-        <w:t>beyond the Monday lecture</w:t>
+        <w:t>Box B</w:t>
       </w:r>
       <w:r>
-        <w:t xml:space="preserve"> in at least one way — an example, pitfall, demonstration, or application it doesn't cover (where no recording is assigned that week, go beyond the textbook chapter). My Case-1 demo models the format.</w:t>
+        <w:t xml:space="preserve"> after the tutor, with the </w:t>
+      </w:r>
+      <w:r>
+        <w:rPr>
+          <w:b/>
+        </w:rPr>
+        <w:t>one concept the case hinges on</w:t>
+      </w:r>
+      <w:r>
+        <w:t xml:space="preserve"> named as the textbook does; (4) </w:t>
+      </w:r>
+      <w:r>
+        <w:rPr>
+          <w:b/>
+        </w:rPr>
+        <w:t>one discussion question</w:t>
+      </w:r>
+      <w:r>
+        <w:t xml:space="preserve"> for the class. Three to six slides; the lecture picks up where you stop.</w:t>
       </w:r>
     </w:p>
     <w:p>
@@ -951,7 +978,7 @@
               <w:rPr>
                 <w:sz w:val="19"/>
               </w:rPr>
-              <w:t>Teach the key idea</w:t>
+              <w:t>Walkthrough of your three boxes</w:t>
             </w:r>
           </w:p>
         </w:tc>
@@ -987,7 +1014,7 @@
               <w:rPr>
                 <w:sz w:val="19"/>
               </w:rPr>
-              <w:t>The choice logic between methods taught clearly enough to apply; the confusing distinctions (focus group vs. IDI, observation vs. experiment) kept straight</w:t>
+              <w:t>Box A shown honestly; the tutor's push shown on screen and judged — accepted with a tagged change, or rejected with a reason; Box B correct against the key</w:t>
             </w:r>
           </w:p>
         </w:tc>
@@ -1007,7 +1034,7 @@
               <w:rPr>
                 <w:sz w:val="19"/>
               </w:rPr>
-              <w:t>Beyond the lecture &amp; delivery</w:t>
+              <w:t>Key concept &amp; discussion</w:t>
             </w:r>
           </w:p>
         </w:tc>
@@ -1043,7 +1070,7 @@
               <w:rPr>
                 <w:sz w:val="19"/>
               </w:rPr>
-              <w:t>At least one specific contribution the Monday lecture and the textbook chapter don't cover; the class engaged (a question, quick poll, or short exercise); 15 min + 5 Q&amp;A, run to time</w:t>
+              <w:t>The concept the case hinges on named and stated correctly; one discussion question the class actually works; 10 min + 5, run to time</w:t>
             </w:r>
           </w:p>
         </w:tc>

</xml_diff>